<commit_message>
Harden medication notification reconciliation
</commit_message>
<xml_diff>
--- a/Care-Circle-Project-Report-2026-10-30.docx
+++ b/Care-Circle-Project-Report-2026-10-30.docx
@@ -71,7 +71,7 @@
           <w:sz w:val="18"/>
           <w:rtl w:val="1"/>
         </w:rPr>
-        <w:t>حتى 30 أكتوبر 2026  |  الاختبارات: 29 أكتوبر 2026  |  mojtabahamed163-ai/Care-Circle — main</w:t>
+        <w:t>حتى 30 أكتوبر 2026  |  جولة Chromium: 29 أكتوبر  |  متابعة الإشعارات: 30 أكتوبر</w:t>
       </w:r>
     </w:p>
     <w:tbl>
@@ -217,7 +217,7 @@
                 <w:sz w:val="18"/>
                 <w:rtl w:val="1"/>
               </w:rPr>
-              <w:t>وظائف أساسية منفذة؛ لا يعني ذلك اعتمادا أو إطلاقا نهائيا.</w:t>
+              <w:t>وظائف أساسية منفذة؛ القبول الحي والهاتف والإنتاج لم تكتمل.</w:t>
             </w:r>
           </w:p>
         </w:tc>
@@ -281,7 +281,7 @@
                 <w:sz w:val="18"/>
                 <w:rtl w:val="1"/>
               </w:rPr>
-              <w:t>51 اختبارا ناجحا؛ MySQL منفصل 1/1؛ check/build ناجحان.</w:t>
+              <w:t>52 اختبارًا في التشغيل الافتراضي؛ 53 عند تفعيل MariaDB الاختبارية؛ check ناجح.</w:t>
             </w:r>
           </w:p>
         </w:tc>
@@ -345,7 +345,7 @@
                 <w:sz w:val="18"/>
                 <w:rtl w:val="1"/>
               </w:rPr>
-              <w:t>الكود: c016955؛ تحديث التقرير: b32542c؛ main متزامن.</w:t>
+              <w:t>الكود والتقرير والمتابعة محفوظة على main في المستودع نفسه.</w:t>
             </w:r>
           </w:p>
         </w:tc>
@@ -409,7 +409,7 @@
                 <w:sz w:val="18"/>
                 <w:rtl w:val="1"/>
               </w:rPr>
-              <w:t>التطبيق غير منشور؛ OAuth والبريد/Push الإنتاجي غير مختبرة أو مهيأة.</w:t>
+              <w:t>التطبيق غير منشور؛ OAuth الحي والهاتف الفعلي والبريد/Push غير مهيأة.</w:t>
             </w:r>
           </w:p>
         </w:tc>
@@ -489,7 +489,7 @@
           <w:sz w:val="20"/>
           <w:rtl w:val="1"/>
         </w:rPr>
-        <w:t>المرحلة الثانية: طلب مساعدة/تبديل مع موافقة، غياب دون إعادة إسناد آلية، سجل تدقيق وتسليم زيارة. تنبيهات الجرعات داخل التطبيق best-effort فقط؛ لا بريد أو Push.</w:t>
+        <w:t>المرحلة الثانية: طلب مساعدة/تبديل بموافقة، غياب دون إعادة إسناد آلية، سجل تدقيق وتسليم زيارة. تنبيهات الجرعات تُحفظ داخل قاعدة البيانات وتُستعاد لسبعة تواريخ محلية بعد عودة الخادم؛ لا بريد أو Push خارجي.</w:t>
       </w:r>
     </w:p>
     <w:p>
@@ -776,7 +776,7 @@
                 <w:sz w:val="18"/>
                 <w:rtl w:val="1"/>
               </w:rPr>
-              <w:t>51 ناجحا؛ اختبار MySQL الاختياري متخطى في هذا التشغيل العام.</w:t>
+              <w:t>52 ناجحًا؛ اختبار MySQL الاختياري متخطى في التشغيل الافتراضي.</w:t>
             </w:r>
           </w:p>
         </w:tc>
@@ -840,7 +840,7 @@
                 <w:sz w:val="18"/>
                 <w:rtl w:val="1"/>
               </w:rPr>
-              <w:t>نجاح 1/1 على MariaDB محلية معزولة بعد ترحيلات 0000–0008.</w:t>
+              <w:t>نجاح 1/1 على MariaDB مؤقتة ومعزولة؛ اختبار الاستعادة والتكرار وتعديل الجدول وسحب الموافقة بالتزامن.</w:t>
             </w:r>
           </w:p>
         </w:tc>
@@ -904,7 +904,7 @@
                 <w:sz w:val="18"/>
                 <w:rtl w:val="1"/>
               </w:rPr>
-              <w:t>نجاح؛ بقي تحذيرا Vite غير المانعين: سكربت platform config وحجم bundle &gt;500 kB.</w:t>
+              <w:t>نجح قبل تغييرات المتابعة؛ لم يُعد البناء ولم يُنشر التطبيق في هذه المتابعة.</w:t>
             </w:r>
           </w:p>
         </w:tc>
@@ -1018,7 +1018,7 @@
           <w:sz w:val="20"/>
           <w:rtl w:val="1"/>
         </w:rPr>
-        <w:t>OAuth الحي وإنشاء الحساب/استعادته عبر المزود؛ تعذر ذلك لأن MANUS_OAUTH_API_URL غير مضبوط. اختبارات callbacks والجلسات محلية وليست تسجيل دخولا حقيقيا.</w:t>
+        <w:t>OAuth الحي وإنشاء/استعادة الحساب عبر المزود لم تُختبر؛ غابت MANUS_PROJECT_ID وMANUS_OAUTH_PORTAL_URL وMANUS_OAUTH_API_URL وMANUS_JWT_SECRET وDATABASE_URL، ولم يكن مشروع WebDev مرفقًا. الاختبارات المحلية ليست دخولًا حقيقيًا.</w:t>
       </w:r>
     </w:p>
     <w:p>
@@ -1047,7 +1047,7 @@
           <w:sz w:val="20"/>
           <w:rtl w:val="1"/>
         </w:rPr>
-        <w:t>هاتف فعلي؛ اختبار الهاتف كان محاكاة Chromium. استخدمت جولة المتصفح بيانات اصطناعية وقاعدة محلية مؤقتة فقط، وحذفت بعد الاختبار.</w:t>
+        <w:t>لم يتوفر هاتف فعلي؛ اختبار 390×844 كان محاكاة Chromium. أضيف دليل تشغيل اختبار غير إنتاجي وقالب إعداد بلا أسرار، لكن التشغيل ينتظر بيئة OAuth وقاعدة اختبار منفصلتين.</w:t>
       </w:r>
     </w:p>
     <w:p>
@@ -1076,7 +1076,7 @@
           <w:sz w:val="20"/>
           <w:rtl w:val="1"/>
         </w:rPr>
-        <w:t>لا مزود بريد أو Push، ولا ضمان تنبيه عند توقف الخادم أو في بيئة متعددة النسخ. لم ينشر التطبيق ولم يقس استهلاكه الفعلي؛ لا ضمان لتكلفة صفر غير محدودة.</w:t>
+        <w:t>لا يوجد إرسال بريد أو Push. المصالحة داخل التطبيق تعمل عند بدء الخادم وكل 30 ثانية وتستعيد آخر سبعة تواريخ محلية؛ لا تعمل أثناء التوقف ولا تعيد ما مضى عليه أكثر من سبعة أيام. لم يُنشر التطبيق ولم تُقَس تكلفته الحية.</w:t>
       </w:r>
     </w:p>
     <w:p>
@@ -1270,7 +1270,7 @@
                 <w:sz w:val="18"/>
                 <w:rtl w:val="1"/>
               </w:rPr>
-              <w:t>تهيئة عنوان وبيانات المزود ثم اختبار تسجيل الدخول والخروج والدعوة واستعادة الحساب بحساب اختبار حقيقي.</w:t>
+              <w:t>قيم OAuth/DB للتطوير عبر Secret Store، أصل HTTPS مسجل، وحساب اختبار مصرح به؛ لا تُرسل الأسرار في المحادثة.</w:t>
             </w:r>
           </w:p>
         </w:tc>
@@ -1334,7 +1334,7 @@
                 <w:sz w:val="18"/>
                 <w:rtl w:val="1"/>
               </w:rPr>
-              <w:t>تجربة iOS/Android فعلية للتحقق من التخطيط واللمس ووضوح النص؛ محاكاة 390×844 لا تغني عنها.</w:t>
+              <w:t>اختبار iOS/Android فعلي؛ الدليل المحلي جاهز، لكن المحاكاة لا تغني عن الجهاز.</w:t>
             </w:r>
           </w:p>
         </w:tc>
@@ -1398,7 +1398,7 @@
                 <w:sz w:val="18"/>
                 <w:rtl w:val="1"/>
               </w:rPr>
-              <w:t>إذا أريد تسليم موثوق: اختيار مزود بريد/Push وعامل دائم متعدد النسخ، ثم اختبار الموافقة والتكرار والإلغاء وإعادة المحاولة.</w:t>
+              <w:t>الداخلية فقط: تعافٍ لسبعة أيام؛ البريد/Push غير مفعّلين ويتطلبان مزودًا واشتراكًا وتجربة حقيقية.</w:t>
             </w:r>
           </w:p>
         </w:tc>
@@ -1462,7 +1462,7 @@
                 <w:sz w:val="18"/>
                 <w:rtl w:val="1"/>
               </w:rPr>
-              <w:t>تهيئة الأسرار وقاعدة مدارة، تطبيق الترحيلات 0000–0008 على staging مع نسخة احتياطية وفحوص دخان، ثم تحديد حدود التكلفة قبل النشر.</w:t>
+              <w:t>لم تُهيأ بيئة إنتاج ولم تُطبق migrations عليها؛ لا نشر ضمن هذه المتابعة.</w:t>
             </w:r>
           </w:p>
         </w:tc>
@@ -1483,7 +1483,9 @@
           <w:sz w:val="18"/>
           <w:rtl w:val="1"/>
         </w:rPr>
-        <w:t>GitHub: main متزامن مع النسخة المحلية عند التحقق. إصلاحات الشيفرة في c016955d855adb0d2522344f0439a0fceed752f5، وسجل التحقق في b32542cfe7c9fbf2a48123cc27b8c3f2947694a9.</w:t>
+      </w:r>
+      <w:r>
+        <w:t>GitHub: تُحفظ متابعة الشيفرة والاختبارات والتقرير الحالي على main في المستودع نفسه؛ يُرفق رابط أحدث commit في رسالة التسليم.</w:t>
       </w:r>
     </w:p>
     <w:p>
@@ -1533,6 +1535,173 @@
             <w:rtl w:val="0"/>
           </w:rPr>
           <w:t>Publishing</w:t>
+        </w:r>
+      </w:hyperlink>
+    </w:p>
+    <w:p>
+      <w:r>
+        <w:br w:type="page"/>
+      </w:r>
+    </w:p>
+    <w:p>
+      <w:pPr>
+        <w:pStyle w:val="Heading1"/>
+        <w:jc w:val="right"/>
+        <w:bidi w:val="1"/>
+      </w:pPr>
+      <w:r>
+        <w:t>متابعة 30 أكتوبر 2026 — نتائج التحقق والبوابات المتبقية</w:t>
+      </w:r>
+    </w:p>
+    <w:p>
+      <w:pPr>
+        <w:spacing w:after="120" w:line="269" w:lineRule="auto"/>
+        <w:jc w:val="right"/>
+        <w:bidi w:val="1"/>
+      </w:pPr>
+      <w:r>
+        <w:rPr>
+          <w:sz w:val="21"/>
+        </w:rPr>
+        <w:t>حلّت هذه المتابعة مشكلة الاعتماد على لقطة دواء قديمة في مجدول التنبيهات، وألغت التنبيهات المعلقة في معاملة تعديل الجدول أو سحب الموافقة. يعيد العامل قراءة صف الدواء تحت قفل، ويمنع التداخل داخل العملية، ويستخدم قفل الصف ومفتاح الحدث الفريد لمنع التكرار. يجري الفحص عند بدء الخادم ثم كل 30 ثانية، ويعالج اليوم والتواريخ المحلية الستة السابقة. بعد توقف طويل تُعرض مراحل الجرعة التي تجاوز موعدها معًا عند عودة الخادم؛ لا تُرسل في وقتها الأصلي. الأحداث الأقدم من سبعة أيام لا تُستعاد، ولا يعمل أي عامل أثناء توقف الخادم.</w:t>
+      </w:r>
+    </w:p>
+    <w:p>
+      <w:pPr>
+        <w:spacing w:after="120" w:line="269" w:lineRule="auto"/>
+        <w:jc w:val="right"/>
+        <w:bidi w:val="1"/>
+      </w:pPr>
+      <w:r>
+        <w:rPr>
+          <w:sz w:val="21"/>
+        </w:rPr>
+        <w:t>الاختبارات الأخيرة: نجح pnpm check. في التشغيل الافتراضي نجح 52 اختبارًا وبقي اختبار MySQL الاختياري متخطى؛ وعند تشغيل المجموعة كاملة على MariaDB محلية مؤقتة ومعزولة نجحت 53/53، كما نجح pnpm test:mysql بنسبة 1/1. غطت قاعدة الاختبار الموافقة المعطلة افتراضيًا، التنبيه في الموعد وبعد 10 و20 دقيقة، الاستعادة بعد انقطاع محاكى، عدم التكرار، إلغاء تأكيد الجرعة، تغيير الجدول، وسحب الموافقة بالتزامن مع المصالحة. طُبقت migrations 0000–0008 على قاعدة مؤقتة فقط ثم أُغلقت وحُذفت. لم يُعد البناء أو النشر.</w:t>
+      </w:r>
+    </w:p>
+    <w:p>
+      <w:pPr>
+        <w:spacing w:after="120" w:line="269" w:lineRule="auto"/>
+        <w:jc w:val="right"/>
+        <w:bidi w:val="1"/>
+      </w:pPr>
+      <w:r>
+        <w:rPr>
+          <w:sz w:val="21"/>
+        </w:rPr>
+        <w:t>OAuth الحي ما زال متوقفًا على إعدادات غير متاحة: MANUS_PROJECT_ID وMANUS_OAUTH_PORTAL_URL وMANUS_OAUTH_API_URL وMANUS_JWT_SECRET وDATABASE_URL، إضافة إلى مشروع WebDev الحالي، وأصل HTTPS تطويري مسجل مع مسار OAuth callback المطابق /api/oauth/callback، وحساب اختبار مصرح به. المطلوب إرفاق المشروع الحالي دون إنشاء مشروع جديد أو وضع هذه القيم في المحادثة؛ تُدار الأسرار عبر Secret Store. خروج التطبيق الحالي يمسح جلسة Care Circle فقط ولا يبطل جلسة Manus لدى المزود.</w:t>
+      </w:r>
+    </w:p>
+    <w:p>
+      <w:pPr>
+        <w:spacing w:after="120" w:line="269" w:lineRule="auto"/>
+        <w:jc w:val="right"/>
+        <w:bidi w:val="1"/>
+      </w:pPr>
+      <w:r>
+        <w:rPr>
+          <w:sz w:val="21"/>
+        </w:rPr>
+        <w:t>لا يوجد جهاز iOS أو Android فعلي في الجلسة. أضيف CARE-CIRCLE-PHONE-TESTING.md ودليل إعداد فارغ القيم في .env.example. يتطلب الاختبار الوظيفي قاعدة غير إنتاجية وأصل HTTPS يمكن للهاتف الوصول إليه؛ لم يُفتح رابط أو تُختبر أجهزة فعلية.</w:t>
+      </w:r>
+    </w:p>
+    <w:p>
+      <w:pPr>
+        <w:spacing w:after="120" w:line="269" w:lineRule="auto"/>
+        <w:jc w:val="right"/>
+        <w:bidi w:val="1"/>
+      </w:pPr>
+      <w:r>
+        <w:rPr>
+          <w:sz w:val="21"/>
+        </w:rPr>
+        <w:t>خيارات الإرسال: تُظهر صفحة Resend المجانية 3,000 رسالة شهريًا وبحد 100 يوميًا، وتُظهر صفحة Mailtrap المجانية 4,000 شهريًا و150 يوميًا دون بطاقة ائتمان؛ كلاهما يتطلب حسابًا ونطاق إرسال ومفتاح API، وتبقى الحدود والخطط قابلة للتغيير. [3] [4] Web Push ممكن من دون عضوية Apple Developer، لكنه يحتاج Service Worker واشتراكًا ومفاتيح VAPID وتخزينًا آمنًا لعناوين الأجهزة؛ على iPhone/iPad يتطلب تطبيق Home Screen من iOS/iPadOS 16.4 أو أحدث. [1] [2] لم يُضف أي ناقل خارجي أو مدفوع، وبقيت الرسائل داخل التطبيق فقط.</w:t>
+      </w:r>
+    </w:p>
+    <w:p>
+      <w:pPr>
+        <w:spacing w:after="120" w:line="269" w:lineRule="auto"/>
+        <w:jc w:val="right"/>
+        <w:bidi w:val="1"/>
+      </w:pPr>
+      <w:r>
+        <w:rPr>
+          <w:sz w:val="21"/>
+        </w:rPr>
+        <w:t>الملفات المساندة لهذه المتابعة: .env.example وCARE-CIRCLE-PHONE-TESTING.md وTODO.md، مع تغييرات في server/care-db.ts وserver/notification-scheduler.ts واختبارات تكامل MySQL. لا يعني اجتياز اختبارات MariaDB المحلية اعتماد OAuth أو الهاتف أو الأداء في الإنتاج.</w:t>
+      </w:r>
+    </w:p>
+    <w:p>
+      <w:pPr>
+        <w:pStyle w:val="Heading2"/>
+        <w:jc w:val="right"/>
+        <w:bidi w:val="1"/>
+      </w:pPr>
+      <w:r>
+        <w:t>مراجع خيارات الإرسال</w:t>
+      </w:r>
+    </w:p>
+    <w:p>
+      <w:pPr>
+        <w:spacing w:after="60"/>
+        <w:jc w:val="right"/>
+        <w:bidi w:val="1"/>
+      </w:pPr>
+      <w:hyperlink r:id="rId13">
+        <w:r>
+          <w:rPr>
+            <w:color w:val="0563C1"/>
+            <w:u w:val="single"/>
+          </w:rPr>
+          <w:t>[1] MDN Push API</w:t>
+        </w:r>
+      </w:hyperlink>
+    </w:p>
+    <w:p>
+      <w:pPr>
+        <w:spacing w:after="60"/>
+        <w:jc w:val="right"/>
+        <w:bidi w:val="1"/>
+      </w:pPr>
+      <w:hyperlink r:id="rId14">
+        <w:r>
+          <w:rPr>
+            <w:color w:val="0563C1"/>
+            <w:u w:val="single"/>
+          </w:rPr>
+          <w:t>[2] Apple Web Push for Web Apps and Browsers</w:t>
+        </w:r>
+      </w:hyperlink>
+    </w:p>
+    <w:p>
+      <w:pPr>
+        <w:spacing w:after="60"/>
+        <w:jc w:val="right"/>
+        <w:bidi w:val="1"/>
+      </w:pPr>
+      <w:hyperlink r:id="rId15">
+        <w:r>
+          <w:rPr>
+            <w:color w:val="0563C1"/>
+            <w:u w:val="single"/>
+          </w:rPr>
+          <w:t>[3] Resend Pricing</w:t>
+        </w:r>
+      </w:hyperlink>
+    </w:p>
+    <w:p>
+      <w:pPr>
+        <w:spacing w:after="60"/>
+        <w:jc w:val="right"/>
+        <w:bidi w:val="1"/>
+      </w:pPr>
+      <w:hyperlink r:id="rId16">
+        <w:r>
+          <w:rPr>
+            <w:color w:val="0563C1"/>
+            <w:u w:val="single"/>
+          </w:rPr>
+          <w:t>[4] Mailtrap Pricing</w:t>
         </w:r>
       </w:hyperlink>
     </w:p>

</xml_diff>

<commit_message>
Document notification reliability follow-up
</commit_message>
<xml_diff>
--- a/Care-Circle-Project-Report-2026-10-30.docx
+++ b/Care-Circle-Project-Report-2026-10-30.docx
@@ -1476,16 +1476,19 @@
         <w:bidi w:val="1"/>
       </w:pPr>
       <w:r>
-        <w:rPr>
-          <w:rFonts w:ascii="Noto Naskh Arabic" w:hAnsi="Noto Naskh Arabic" w:cs="Noto Naskh Arabic" w:eastAsia="Noto Naskh Arabic"/>
-          <w:b w:val="0"/>
-          <w:color w:val="66756F"/>
-          <w:sz w:val="18"/>
-          <w:rtl w:val="1"/>
-        </w:rPr>
+        <w:t xml:space="preserve">GitHub: commit تنفيذ إصلاحات الإشعارات واختبارات MariaDB ودليل الهاتف وقالب البيئة: </w:t>
       </w:r>
+      <w:hyperlink r:id="rId17">
+        <w:r>
+          <w:rPr>
+            <w:color w:val="0563C1"/>
+            <w:u w:val="single"/>
+          </w:rPr>
+          <w:t>1ae0e52</w:t>
+        </w:r>
+      </w:hyperlink>
       <w:r>
-        <w:t>GitHub: تُحفظ متابعة الشيفرة والاختبارات والتقرير الحالي على main في المستودع نفسه؛ يُرفق رابط أحدث commit في رسالة التسليم.</w:t>
+        <w:t xml:space="preserve"> على main؛ رابط commit الأحدث بعد مزامنة التقرير مذكور في رسالة التسليم.</w:t>
       </w:r>
     </w:p>
     <w:p>

</xml_diff>